<commit_message>
Adiciona logos oficiais (UAM + Anima) e rodapé ao Checkpoint 1 do A3
</commit_message>
<xml_diff>
--- a/garantia-qualidade-software/a3/checkpoint-1/Checkpoint1_A3_SpringPetclinic.docx
+++ b/garantia-qualidade-software/a3/checkpoint-1/Checkpoint1_A3_SpringPetclinic.docx
@@ -575,6 +575,50 @@
     </w:p>
     <w:p/>
     <w:p>
+      <w:r>
+        <w:br w:type="page"/>
+      </w:r>
+    </w:p>
+    <w:p>
+      <w:pPr>
+        <w:jc w:val="right"/>
+      </w:pPr>
+      <w:r>
+        <w:drawing>
+          <wp:inline xmlns:a="http://schemas.openxmlformats.org/drawingml/2006/main" xmlns:pic="http://schemas.openxmlformats.org/drawingml/2006/picture">
+            <wp:extent cx="1097280" cy="499262"/>
+            <wp:docPr id="1" name="Picture 1"/>
+            <wp:cNvGraphicFramePr>
+              <a:graphicFrameLocks noChangeAspect="1"/>
+            </wp:cNvGraphicFramePr>
+            <a:graphic>
+              <a:graphicData uri="http://schemas.openxmlformats.org/drawingml/2006/picture">
+                <pic:pic>
+                  <pic:nvPicPr>
+                    <pic:cNvPr id="0" name="logo_anima.png"/>
+                    <pic:cNvPicPr/>
+                  </pic:nvPicPr>
+                  <pic:blipFill>
+                    <a:blip r:embed="rId11"/>
+                    <a:stretch>
+                      <a:fillRect/>
+                    </a:stretch>
+                  </pic:blipFill>
+                  <pic:spPr>
+                    <a:xfrm>
+                      <a:off x="0" y="0"/>
+                      <a:ext cx="1097280" cy="499262"/>
+                    </a:xfrm>
+                    <a:prstGeom prst="rect"/>
+                  </pic:spPr>
+                </pic:pic>
+              </a:graphicData>
+            </a:graphic>
+          </wp:inline>
+        </w:drawing>
+      </w:r>
+    </w:p>
+    <w:p>
       <w:pPr>
         <w:jc w:val="center"/>
       </w:pPr>
@@ -1082,6 +1126,8 @@
       </w:tr>
     </w:tbl>
     <w:sectPr>
+      <w:headerReference w:type="default" r:id="rId9"/>
+      <w:footerReference w:type="default" r:id="rId10"/>
       <w:pgSz w:w="12240" w:h="15840"/>
       <w:pgMar w:top="1440" w:right="1800" w:bottom="1440" w:left="1800" w:header="720" w:footer="720" w:gutter="0"/>
       <w:cols w:space="720"/>
@@ -1089,6 +1135,95 @@
     </w:sectPr>
   </w:body>
 </w:document>
+</file>
+
+<file path=word/footer1.xml><?xml version="1.0" encoding="utf-8"?>
+<w:ftr xmlns:m="http://schemas.openxmlformats.org/officeDocument/2006/math" xmlns:mc="http://schemas.openxmlformats.org/markup-compatibility/2006" xmlns:mo="http://schemas.microsoft.com/office/mac/office/2008/main" xmlns:mv="urn:schemas-microsoft-com:mac:vml" xmlns:o="urn:schemas-microsoft-com:office:office" xmlns:r="http://schemas.openxmlformats.org/officeDocument/2006/relationships" xmlns:v="urn:schemas-microsoft-com:vml" xmlns:w10="urn:schemas-microsoft-com:office:word" xmlns:w14="http://schemas.microsoft.com/office/word/2010/wordml" xmlns:w="http://schemas.openxmlformats.org/wordprocessingml/2006/main" xmlns:wne="http://schemas.microsoft.com/office/word/2006/wordml" xmlns:wp14="http://schemas.microsoft.com/office/word/2010/wordprocessingDrawing" xmlns:wp="http://schemas.openxmlformats.org/drawingml/2006/wordprocessingDrawing" xmlns:wpc="http://schemas.microsoft.com/office/word/2010/wordprocessingCanvas" xmlns:wpg="http://schemas.microsoft.com/office/word/2010/wordprocessingGroup" xmlns:wpi="http://schemas.microsoft.com/office/word/2010/wordprocessingInk" xmlns:wps="http://schemas.microsoft.com/office/word/2010/wordprocessingShape" mc:Ignorable="w14 wp14">
+  <w:p>
+    <w:pPr>
+      <w:pStyle w:val="Footer"/>
+      <w:tabs>
+        <w:tab w:pos="9360" w:val="left"/>
+      </w:tabs>
+    </w:pPr>
+    <w:r>
+      <w:rPr>
+        <w:sz w:val="18"/>
+      </w:rPr>
+      <w:t xml:space="preserve">Página </w:t>
+    </w:r>
+    <w:r>
+      <w:fldChar w:fldCharType="begin"/>
+      <w:instrText xml:space="preserve">PAGE</w:instrText>
+      <w:fldChar w:fldCharType="end"/>
+    </w:r>
+    <w:r>
+      <w:rPr>
+        <w:sz w:val="18"/>
+      </w:rPr>
+      <w:t xml:space="preserve"> | </w:t>
+    </w:r>
+    <w:r>
+      <w:fldChar w:fldCharType="begin"/>
+      <w:instrText xml:space="preserve">NUMPAGES</w:instrText>
+      <w:fldChar w:fldCharType="end"/>
+    </w:r>
+    <w:r>
+      <w:tab/>
+    </w:r>
+    <w:r>
+      <w:rPr>
+        <w:i/>
+        <w:sz w:val="18"/>
+      </w:rPr>
+      <w:t>Profa. Cássia Assis</w:t>
+    </w:r>
+  </w:p>
+</w:ftr>
+</file>
+
+<file path=word/header1.xml><?xml version="1.0" encoding="utf-8"?>
+<w:hdr xmlns:m="http://schemas.openxmlformats.org/officeDocument/2006/math" xmlns:mc="http://schemas.openxmlformats.org/markup-compatibility/2006" xmlns:mo="http://schemas.microsoft.com/office/mac/office/2008/main" xmlns:mv="urn:schemas-microsoft-com:mac:vml" xmlns:o="urn:schemas-microsoft-com:office:office" xmlns:r="http://schemas.openxmlformats.org/officeDocument/2006/relationships" xmlns:v="urn:schemas-microsoft-com:vml" xmlns:w10="urn:schemas-microsoft-com:office:word" xmlns:w14="http://schemas.microsoft.com/office/word/2010/wordml" xmlns:w="http://schemas.openxmlformats.org/wordprocessingml/2006/main" xmlns:wne="http://schemas.microsoft.com/office/word/2006/wordml" xmlns:wp14="http://schemas.microsoft.com/office/word/2010/wordprocessingDrawing" xmlns:wp="http://schemas.openxmlformats.org/drawingml/2006/wordprocessingDrawing" xmlns:wpc="http://schemas.microsoft.com/office/word/2010/wordprocessingCanvas" xmlns:wpg="http://schemas.microsoft.com/office/word/2010/wordprocessingGroup" xmlns:wpi="http://schemas.microsoft.com/office/word/2010/wordprocessingInk" xmlns:wps="http://schemas.microsoft.com/office/word/2010/wordprocessingShape" mc:Ignorable="w14 wp14">
+  <w:p>
+    <w:pPr>
+      <w:pStyle w:val="Header"/>
+    </w:pPr>
+    <w:r>
+      <w:drawing>
+        <wp:inline xmlns:a="http://schemas.openxmlformats.org/drawingml/2006/main" xmlns:pic="http://schemas.openxmlformats.org/drawingml/2006/picture">
+          <wp:extent cx="2377440" cy="500146"/>
+          <wp:docPr id="1" name="Picture 1"/>
+          <wp:cNvGraphicFramePr>
+            <a:graphicFrameLocks noChangeAspect="1"/>
+          </wp:cNvGraphicFramePr>
+          <a:graphic>
+            <a:graphicData uri="http://schemas.openxmlformats.org/drawingml/2006/picture">
+              <pic:pic>
+                <pic:nvPicPr>
+                  <pic:cNvPr id="0" name="logo_header.png"/>
+                  <pic:cNvPicPr/>
+                </pic:nvPicPr>
+                <pic:blipFill>
+                  <a:blip r:embed="rId1"/>
+                  <a:stretch>
+                    <a:fillRect/>
+                  </a:stretch>
+                </pic:blipFill>
+                <pic:spPr>
+                  <a:xfrm>
+                    <a:off x="0" y="0"/>
+                    <a:ext cx="2377440" cy="500146"/>
+                  </a:xfrm>
+                  <a:prstGeom prst="rect"/>
+                </pic:spPr>
+              </pic:pic>
+            </a:graphicData>
+          </a:graphic>
+        </wp:inline>
+      </w:drawing>
+    </w:r>
+  </w:p>
+</w:hdr>
 </file>
 
 <file path=word/numbering.xml><?xml version="1.0" encoding="utf-8"?>

</xml_diff>

<commit_message>
Ajusta Checkpoint 1 do A3 para bater exatamente com o modelo oficial (banner, cores, checklist)
</commit_message>
<xml_diff>
--- a/garantia-qualidade-software/a3/checkpoint-1/Checkpoint1_A3_SpringPetclinic.docx
+++ b/garantia-qualidade-software/a3/checkpoint-1/Checkpoint1_A3_SpringPetclinic.docx
@@ -2,26 +2,61 @@
 <file path=word/document.xml><?xml version="1.0" encoding="utf-8"?>
 <w:document xmlns:wpc="http://schemas.microsoft.com/office/word/2010/wordprocessingCanvas" xmlns:mo="http://schemas.microsoft.com/office/mac/office/2008/main" xmlns:mc="http://schemas.openxmlformats.org/markup-compatibility/2006" xmlns:mv="urn:schemas-microsoft-com:mac:vml" xmlns:o="urn:schemas-microsoft-com:office:office" xmlns:r="http://schemas.openxmlformats.org/officeDocument/2006/relationships" xmlns:m="http://schemas.openxmlformats.org/officeDocument/2006/math" xmlns:v="urn:schemas-microsoft-com:vml" xmlns:wp14="http://schemas.microsoft.com/office/word/2010/wordprocessingDrawing" xmlns:wp="http://schemas.openxmlformats.org/drawingml/2006/wordprocessingDrawing" xmlns:w10="urn:schemas-microsoft-com:office:word" xmlns:w="http://schemas.openxmlformats.org/wordprocessingml/2006/main" xmlns:w14="http://schemas.microsoft.com/office/word/2010/wordml" xmlns:wpg="http://schemas.microsoft.com/office/word/2010/wordprocessingGroup" xmlns:wpi="http://schemas.microsoft.com/office/word/2010/wordprocessingInk" xmlns:wne="http://schemas.microsoft.com/office/word/2006/wordml" xmlns:wps="http://schemas.microsoft.com/office/word/2010/wordprocessingShape" mc:Ignorable="w14 wp14">
   <w:body>
-    <w:p>
-      <w:pPr>
-        <w:jc w:val="center"/>
-      </w:pPr>
-      <w:r>
-        <w:rPr>
-          <w:b/>
-          <w:color w:val="16233D"/>
-          <w:sz w:val="36"/>
-        </w:rPr>
-        <w:t>1º CHECKPOINT PARA ENTREGA DA A3</w:t>
-      </w:r>
-    </w:p>
+    <w:p/>
+    <w:tbl>
+      <w:tblPr>
+        <w:tblW w:type="auto" w:w="0"/>
+        <w:tblLayout w:type="autofit"/>
+        <w:tblLook w:firstColumn="1" w:firstRow="1" w:lastColumn="0" w:lastRow="0" w:noHBand="0" w:noVBand="1" w:val="04A0"/>
+        <w:tblBorders>
+          <w:top w:val="none"/>
+          <w:left w:val="none"/>
+          <w:bottom w:val="none"/>
+          <w:right w:val="none"/>
+          <w:insideH w:val="none"/>
+          <w:insideV w:val="none"/>
+        </w:tblBorders>
+      </w:tblPr>
+      <w:tblGrid>
+        <w:gridCol w:w="8640"/>
+      </w:tblGrid>
+      <w:tr>
+        <w:tc>
+          <w:tcPr>
+            <w:tcW w:type="dxa" w:w="8640"/>
+            <w:shd w:val="clear" w:color="auto" w:fill="2E5A96"/>
+          </w:tcPr>
+          <w:p>
+            <w:pPr>
+              <w:spacing w:before="120" w:after="120"/>
+              <w:jc w:val="center"/>
+            </w:pPr>
+            <w:r>
+              <w:rPr>
+                <w:b/>
+                <w:color w:val="FFFFFF"/>
+                <w:sz w:val="32"/>
+              </w:rPr>
+              <w:t>1º CHECKPOINT PARA ENTREGA DA A3</w:t>
+            </w:r>
+          </w:p>
+        </w:tc>
+      </w:tr>
+    </w:tbl>
+    <w:p/>
     <w:p>
       <w:r>
         <w:rPr>
           <w:b/>
-          <w:sz w:val="24"/>
         </w:rPr>
-        <w:t>Data da entrega: 11/09/2026</w:t>
+        <w:t xml:space="preserve">Data da entrega: </w:t>
+      </w:r>
+      <w:r>
+        <w:rPr>
+          <w:b/>
+          <w:color w:val="1F5FA8"/>
+        </w:rPr>
+        <w:t>11/09/2026</w:t>
       </w:r>
     </w:p>
     <w:p/>
@@ -30,7 +65,7 @@
         <w:rPr>
           <w:b/>
         </w:rPr>
-        <w:t>Integrantes:</w:t>
+        <w:t>•  Integrantes:</w:t>
       </w:r>
     </w:p>
     <w:tbl>
@@ -209,165 +244,10 @@
       <w:r>
         <w:rPr>
           <w:b/>
-          <w:color w:val="16233D"/>
-          <w:sz w:val="26"/>
+          <w:color w:val="000000"/>
+          <w:sz w:val="22"/>
         </w:rPr>
         <w:t>1. IDENTIFICAÇÃO DO PROJETO</w:t>
-      </w:r>
-    </w:p>
-    <w:p>
-      <w:r>
-        <w:rPr>
-          <w:b/>
-          <w:color w:val="16233D"/>
-          <w:sz w:val="26"/>
-        </w:rPr>
-        <w:t>2. Sistema escolhido - Spring PetClinic (Angular + REST)</w:t>
-      </w:r>
-    </w:p>
-    <w:p>
-      <w:pPr>
-        <w:ind w:left="432"/>
-      </w:pPr>
-      <w:r>
-        <w:rPr>
-          <w:b w:val="0"/>
-          <w:sz w:val="22"/>
-        </w:rPr>
-        <w:t>Repositórios utilizados:</w:t>
-      </w:r>
-    </w:p>
-    <w:p>
-      <w:pPr>
-        <w:ind w:left="432"/>
-      </w:pPr>
-      <w:r>
-        <w:rPr>
-          <w:b w:val="0"/>
-          <w:sz w:val="22"/>
-        </w:rPr>
-        <w:t>Frontend: github.com/spring-petclinic/spring-petclinic-angular</w:t>
-      </w:r>
-    </w:p>
-    <w:p>
-      <w:pPr>
-        <w:ind w:left="432"/>
-      </w:pPr>
-      <w:r>
-        <w:rPr>
-          <w:b w:val="0"/>
-          <w:sz w:val="22"/>
-        </w:rPr>
-        <w:t>Backend / API: github.com/spring-petclinic/spring-petclinic-rest</w:t>
-      </w:r>
-    </w:p>
-    <w:p/>
-    <w:p>
-      <w:pPr>
-        <w:ind w:left="432"/>
-      </w:pPr>
-      <w:r>
-        <w:rPr>
-          <w:b/>
-          <w:sz w:val="22"/>
-        </w:rPr>
-        <w:t>Ambiente e tecnologias:</w:t>
-      </w:r>
-    </w:p>
-    <w:p>
-      <w:pPr>
-        <w:ind w:left="432"/>
-      </w:pPr>
-      <w:r>
-        <w:rPr>
-          <w:b w:val="0"/>
-          <w:sz w:val="22"/>
-        </w:rPr>
-        <w:t>• Sistema operacional: Windows 10</w:t>
-      </w:r>
-    </w:p>
-    <w:p>
-      <w:pPr>
-        <w:ind w:left="432"/>
-      </w:pPr>
-      <w:r>
-        <w:rPr>
-          <w:b w:val="0"/>
-          <w:sz w:val="22"/>
-        </w:rPr>
-        <w:t>• Node.js versão 24 ou superior</w:t>
-      </w:r>
-    </w:p>
-    <w:p>
-      <w:pPr>
-        <w:ind w:left="432"/>
-      </w:pPr>
-      <w:r>
-        <w:rPr>
-          <w:b w:val="0"/>
-          <w:sz w:val="22"/>
-        </w:rPr>
-        <w:t>• NPM</w:t>
-      </w:r>
-    </w:p>
-    <w:p>
-      <w:pPr>
-        <w:ind w:left="432"/>
-      </w:pPr>
-      <w:r>
-        <w:rPr>
-          <w:b w:val="0"/>
-          <w:sz w:val="22"/>
-        </w:rPr>
-        <w:t>• Docker Desktop</w:t>
-      </w:r>
-    </w:p>
-    <w:p>
-      <w:pPr>
-        <w:ind w:left="432"/>
-      </w:pPr>
-      <w:r>
-        <w:rPr>
-          <w:b w:val="0"/>
-          <w:sz w:val="22"/>
-        </w:rPr>
-        <w:t>• WSL (Windows Subsystem for Linux)</w:t>
-      </w:r>
-    </w:p>
-    <w:p>
-      <w:pPr>
-        <w:ind w:left="432"/>
-      </w:pPr>
-      <w:r>
-        <w:rPr>
-          <w:b w:val="0"/>
-          <w:sz w:val="22"/>
-        </w:rPr>
-        <w:t>• BIOS: Virtualization habilitada</w:t>
-      </w:r>
-    </w:p>
-    <w:p>
-      <w:pPr>
-        <w:ind w:left="432"/>
-      </w:pPr>
-      <w:r>
-        <w:rPr>
-          <w:b w:val="0"/>
-          <w:sz w:val="22"/>
-        </w:rPr>
-        <w:t>• Frontend: Angular</w:t>
-      </w:r>
-    </w:p>
-    <w:p>
-      <w:pPr>
-        <w:ind w:left="432"/>
-      </w:pPr>
-      <w:r>
-        <w:rPr>
-          <w:b w:val="0"/>
-          <w:sz w:val="22"/>
-        </w:rPr>
-        <w:t>• Backend: Spring Boot (Java)</w:t>
       </w:r>
     </w:p>
     <w:p/>
@@ -375,83 +255,158 @@
       <w:r>
         <w:rPr>
           <w:b/>
-          <w:color w:val="16233D"/>
-          <w:sz w:val="26"/>
+          <w:color w:val="000000"/>
+          <w:sz w:val="22"/>
         </w:rPr>
-        <w:t>3. Resumo sobre Documentação de Configuração</w:t>
+        <w:t>2. Sistema escolhido - Spring PetClinic (Angular + REST)</w:t>
       </w:r>
     </w:p>
     <w:p>
       <w:pPr>
-        <w:ind w:left="432"/>
+        <w:ind w:left="576"/>
+      </w:pPr>
+      <w:r>
+        <w:rPr>
+          <w:b w:val="0"/>
+          <w:color w:val="1F5FA8"/>
+          <w:sz w:val="22"/>
+          <w:u w:val="single"/>
+        </w:rPr>
+        <w:t>Frontend: github.com/spring-petclinic/spring-petclinic-angular</w:t>
+      </w:r>
+    </w:p>
+    <w:p>
+      <w:pPr>
+        <w:ind w:left="576"/>
+      </w:pPr>
+      <w:r>
+        <w:rPr>
+          <w:b w:val="0"/>
+          <w:color w:val="1F5FA8"/>
+          <w:sz w:val="22"/>
+          <w:u w:val="single"/>
+        </w:rPr>
+        <w:t>Backend / API: github.com/spring-petclinic/spring-petclinic-rest</w:t>
+      </w:r>
+    </w:p>
+    <w:p>
+      <w:pPr>
+        <w:ind w:left="576"/>
       </w:pPr>
       <w:r>
         <w:rPr>
           <w:b w:val="0"/>
           <w:sz w:val="22"/>
         </w:rPr>
-        <w:t>O projeto é dividido em dois repositórios: o frontend (spring-petclinic-angular) e o backend/API REST (spring-petclinic-rest), que precisam rodar em conjunto — o Angular consome os dados servidos pela API REST.</w:t>
-      </w:r>
-    </w:p>
-    <w:p/>
-    <w:p>
-      <w:pPr>
-        <w:ind w:left="432"/>
-      </w:pPr>
-      <w:r>
-        <w:rPr>
-          <w:b/>
-          <w:sz w:val="22"/>
-        </w:rPr>
-        <w:t>Passos de instalação:</w:t>
+        <w:t>Windows 10</w:t>
       </w:r>
     </w:p>
     <w:p>
       <w:pPr>
-        <w:ind w:left="432"/>
+        <w:ind w:left="576"/>
       </w:pPr>
       <w:r>
         <w:rPr>
           <w:b w:val="0"/>
           <w:sz w:val="22"/>
         </w:rPr>
-        <w:t>1. Clonar o repositório spring-petclinic-angular e, na pasta clonada, rodar "npm install" pelo cmd — isso instala as dependências e gera o package-lock.json.</w:t>
+        <w:t>Node.js 24 ou superior</w:t>
       </w:r>
     </w:p>
     <w:p>
       <w:pPr>
-        <w:ind w:left="432"/>
+        <w:ind w:left="576"/>
       </w:pPr>
       <w:r>
         <w:rPr>
           <w:b w:val="0"/>
           <w:sz w:val="22"/>
         </w:rPr>
-        <w:t>2. Habilitar a Virtualization na BIOS da placa-mãe (necessário para o Docker funcionar no Windows).</w:t>
+        <w:t>NPM</w:t>
       </w:r>
     </w:p>
     <w:p>
       <w:pPr>
-        <w:ind w:left="432"/>
+        <w:ind w:left="576"/>
       </w:pPr>
       <w:r>
         <w:rPr>
           <w:b w:val="0"/>
           <w:sz w:val="22"/>
         </w:rPr>
-        <w:t>3. Clonar o repositório spring-petclinic-rest; se o WSL não estiver instalado, abrir o cmd na pasta clonada e instalar o WSL (o Docker Desktop indica os passos automaticamente).</w:t>
+        <w:t>Docker Desktop</w:t>
       </w:r>
     </w:p>
     <w:p>
       <w:pPr>
-        <w:ind w:left="432"/>
+        <w:ind w:left="576"/>
       </w:pPr>
       <w:r>
         <w:rPr>
           <w:b w:val="0"/>
           <w:sz w:val="22"/>
         </w:rPr>
-        <w:t>4. Subir o backend via Docker: docker run -p 9966:9966 springcommunity/spring-petclinic-rest</w:t>
+        <w:t>WSL (Windows Subsystem for Linux)</w:t>
+      </w:r>
+    </w:p>
+    <w:p>
+      <w:pPr>
+        <w:ind w:left="576"/>
+      </w:pPr>
+      <w:r>
+        <w:rPr>
+          <w:b w:val="0"/>
+          <w:sz w:val="22"/>
+        </w:rPr>
+        <w:t>BIOS: Virtualization habilitada</w:t>
+      </w:r>
+    </w:p>
+    <w:p>
+      <w:pPr>
+        <w:ind w:left="576"/>
+      </w:pPr>
+      <w:r>
+        <w:rPr>
+          <w:b w:val="0"/>
+          <w:sz w:val="22"/>
+        </w:rPr>
+        <w:t>Frontend:</w:t>
+      </w:r>
+    </w:p>
+    <w:p>
+      <w:pPr>
+        <w:ind w:left="576"/>
+      </w:pPr>
+      <w:r>
+        <w:rPr>
+          <w:b w:val="0"/>
+          <w:sz w:val="22"/>
+        </w:rPr>
+        <w:t>Angular</w:t>
+      </w:r>
+    </w:p>
+    <w:p>
+      <w:pPr>
+        <w:ind w:left="576"/>
+      </w:pPr>
+      <w:r>
+        <w:rPr>
+          <w:b w:val="0"/>
+          <w:sz w:val="22"/>
+        </w:rPr>
+        <w:t>Backend:</w:t>
+      </w:r>
+    </w:p>
+    <w:p>
+      <w:pPr>
+        <w:ind w:left="576"/>
+      </w:pPr>
+      <w:r>
+        <w:rPr>
+          <w:b w:val="0"/>
+          <w:sz w:val="22"/>
+        </w:rPr>
+        <w:t>Spring Boot (Java)</w:t>
       </w:r>
     </w:p>
     <w:p/>
@@ -459,15 +414,98 @@
       <w:r>
         <w:rPr>
           <w:b/>
-          <w:color w:val="16233D"/>
-          <w:sz w:val="26"/>
+          <w:color w:val="000000"/>
+          <w:sz w:val="22"/>
+        </w:rPr>
+        <w:t>3. Resumo sobre Documentação de Configuração</w:t>
+      </w:r>
+    </w:p>
+    <w:p>
+      <w:pPr>
+        <w:ind w:left="576"/>
+      </w:pPr>
+      <w:r>
+        <w:rPr>
+          <w:b w:val="0"/>
+          <w:sz w:val="22"/>
+        </w:rPr>
+        <w:t>O projeto é dividido entre dois repositórios: frontend e backend.</w:t>
+      </w:r>
+    </w:p>
+    <w:p>
+      <w:pPr>
+        <w:ind w:left="576"/>
+      </w:pPr>
+      <w:r>
+        <w:rPr>
+          <w:b w:val="0"/>
+          <w:sz w:val="22"/>
+        </w:rPr>
+        <w:t>O frontend (Angular) está no repositório:</w:t>
+      </w:r>
+    </w:p>
+    <w:p>
+      <w:pPr>
+        <w:ind w:left="576"/>
+      </w:pPr>
+      <w:r>
+        <w:rPr>
+          <w:b w:val="0"/>
+          <w:sz w:val="22"/>
+        </w:rPr>
+        <w:t>spring-petclinic-angular</w:t>
+      </w:r>
+    </w:p>
+    <w:p>
+      <w:pPr>
+        <w:ind w:left="576"/>
+      </w:pPr>
+      <w:r>
+        <w:rPr>
+          <w:b w:val="0"/>
+          <w:sz w:val="22"/>
+        </w:rPr>
+        <w:t>O backend (API REST) está no repositório:</w:t>
+      </w:r>
+    </w:p>
+    <w:p>
+      <w:pPr>
+        <w:ind w:left="576"/>
+      </w:pPr>
+      <w:r>
+        <w:rPr>
+          <w:b w:val="0"/>
+          <w:sz w:val="22"/>
+        </w:rPr>
+        <w:t>spring-petclinic-rest</w:t>
+      </w:r>
+    </w:p>
+    <w:p>
+      <w:pPr>
+        <w:ind w:left="576"/>
+      </w:pPr>
+      <w:r>
+        <w:rPr>
+          <w:b w:val="0"/>
+          <w:sz w:val="22"/>
+        </w:rPr>
+        <w:t>O backend também pode ser executado via imagem Docker pronta, sem precisar montar o ambiente Java localmente.</w:t>
+      </w:r>
+    </w:p>
+    <w:p/>
+    <w:p>
+      <w:r>
+        <w:rPr>
+          <w:b/>
+          <w:color w:val="000000"/>
+          <w:sz w:val="22"/>
         </w:rPr>
         <w:t>4. Análise Inicial da Arquitetura</w:t>
       </w:r>
     </w:p>
     <w:p>
       <w:pPr>
-        <w:ind w:left="432"/>
+        <w:ind w:left="576"/>
       </w:pPr>
       <w:r>
         <w:rPr>
@@ -479,63 +517,62 @@
     </w:p>
     <w:p>
       <w:pPr>
-        <w:ind w:left="432"/>
+        <w:ind w:left="576"/>
       </w:pPr>
       <w:r>
         <w:rPr>
           <w:b w:val="0"/>
           <w:sz w:val="22"/>
         </w:rPr>
-        <w:t>• Node.js e NPM — instalação de dependências e execução do frontend Angular;</w:t>
+        <w:t>Node.js e npm — instalação de dependências e execução do frontend Angular;</w:t>
       </w:r>
     </w:p>
     <w:p>
       <w:pPr>
-        <w:ind w:left="432"/>
+        <w:ind w:left="576"/>
       </w:pPr>
       <w:r>
         <w:rPr>
           <w:b w:val="0"/>
           <w:sz w:val="22"/>
         </w:rPr>
-        <w:t>• Docker Desktop — execução do backend Spring Petclinic REST em container, expondo a API na porta 9966;</w:t>
+        <w:t>Docker Desktop — execução do backend Spring Petclinic REST em container, expondo a API na porta 9966;</w:t>
       </w:r>
     </w:p>
     <w:p>
       <w:pPr>
-        <w:ind w:left="432"/>
+        <w:ind w:left="576"/>
       </w:pPr>
       <w:r>
         <w:rPr>
           <w:b w:val="0"/>
           <w:sz w:val="22"/>
         </w:rPr>
-        <w:t>• WSL 2 — pré-requisito do Docker Desktop no Windows;</w:t>
+        <w:t>WSL 2 — pré-requisito do Docker Desktop no Windows;</w:t>
       </w:r>
     </w:p>
     <w:p>
       <w:pPr>
-        <w:ind w:left="432"/>
+        <w:ind w:left="576"/>
       </w:pPr>
       <w:r>
         <w:rPr>
           <w:b w:val="0"/>
           <w:sz w:val="22"/>
         </w:rPr>
-        <w:t>• Angular CLI — desenvolvimento e execução do frontend.</w:t>
+        <w:t>BIOS com Virtualization habilitada — necessário para o Docker e o WSL funcionarem;</w:t>
       </w:r>
     </w:p>
-    <w:p/>
     <w:p>
       <w:pPr>
-        <w:ind w:left="432"/>
+        <w:ind w:left="576"/>
       </w:pPr>
       <w:r>
         <w:rPr>
           <w:b w:val="0"/>
           <w:sz w:val="22"/>
         </w:rPr>
-        <w:t>Arquitetura geral: o frontend Angular (SPA) faz requisições HTTP para a API REST do Spring PetClinic (backend Java/Spring Boot), que expõe os dados de veterinários, donos, pets e consultas. O backend roda containerizado via Docker, isolando as dependências do ambiente Java/Maven do host.</w:t>
+        <w:t>Angular CLI — desenvolvimento e execução do frontend.</w:t>
       </w:r>
     </w:p>
     <w:p/>
@@ -543,81 +580,168 @@
       <w:r>
         <w:rPr>
           <w:b/>
-          <w:color w:val="16233D"/>
-          <w:sz w:val="26"/>
+          <w:sz w:val="22"/>
         </w:rPr>
-        <w:t>5. Post no LinkedIn para esse checkpoint</w:t>
+        <w:t xml:space="preserve">5. </w:t>
+      </w:r>
+      <w:r>
+        <w:rPr>
+          <w:b/>
+          <w:color w:val="1F5FA8"/>
+          <w:sz w:val="22"/>
+          <w:u w:val="single"/>
+        </w:rPr>
+        <w:t>Post no LinkedIn para esse checkpoint</w:t>
       </w:r>
     </w:p>
     <w:p>
       <w:pPr>
-        <w:ind w:left="432"/>
+        <w:ind w:left="576"/>
       </w:pPr>
       <w:r>
         <w:rPr>
-          <w:b w:val="0"/>
+          <w:b/>
+          <w:color w:val="008000"/>
+        </w:rPr>
+        <w:t xml:space="preserve">✔  </w:t>
+      </w:r>
+      <w:r>
+        <w:rPr>
           <w:sz w:val="22"/>
         </w:rPr>
-        <w:t>☐ Link do post</w:t>
+        <w:t>Link do post</w:t>
       </w:r>
     </w:p>
     <w:p>
       <w:pPr>
-        <w:ind w:left="432"/>
+        <w:ind w:left="576"/>
       </w:pPr>
       <w:r>
         <w:rPr>
-          <w:b w:val="0"/>
+          <w:b/>
+          <w:color w:val="008000"/>
+        </w:rPr>
+        <w:t xml:space="preserve">✔  </w:t>
+      </w:r>
+      <w:r>
+        <w:rPr>
           <w:sz w:val="22"/>
         </w:rPr>
-        <w:t>☐ Print do post no LinkedIn</w:t>
+        <w:t>Print do post no LinkedIn</w:t>
       </w:r>
     </w:p>
-    <w:p/>
     <w:p>
       <w:r>
         <w:br w:type="page"/>
       </w:r>
     </w:p>
-    <w:p>
-      <w:pPr>
-        <w:jc w:val="right"/>
-      </w:pPr>
-      <w:r>
-        <w:drawing>
-          <wp:inline xmlns:a="http://schemas.openxmlformats.org/drawingml/2006/main" xmlns:pic="http://schemas.openxmlformats.org/drawingml/2006/picture">
-            <wp:extent cx="1097280" cy="499262"/>
-            <wp:docPr id="1" name="Picture 1"/>
-            <wp:cNvGraphicFramePr>
-              <a:graphicFrameLocks noChangeAspect="1"/>
-            </wp:cNvGraphicFramePr>
-            <a:graphic>
-              <a:graphicData uri="http://schemas.openxmlformats.org/drawingml/2006/picture">
-                <pic:pic>
-                  <pic:nvPicPr>
-                    <pic:cNvPr id="0" name="logo_anima.png"/>
-                    <pic:cNvPicPr/>
-                  </pic:nvPicPr>
-                  <pic:blipFill>
-                    <a:blip r:embed="rId11"/>
-                    <a:stretch>
-                      <a:fillRect/>
-                    </a:stretch>
-                  </pic:blipFill>
-                  <pic:spPr>
-                    <a:xfrm>
-                      <a:off x="0" y="0"/>
-                      <a:ext cx="1097280" cy="499262"/>
-                    </a:xfrm>
-                    <a:prstGeom prst="rect"/>
-                  </pic:spPr>
-                </pic:pic>
-              </a:graphicData>
-            </a:graphic>
-          </wp:inline>
-        </w:drawing>
-      </w:r>
-    </w:p>
+    <w:tbl>
+      <w:tblPr>
+        <w:tblW w:type="auto" w:w="0"/>
+        <w:tblLayout w:type="autofit"/>
+        <w:tblLook w:firstColumn="1" w:firstRow="1" w:lastColumn="0" w:lastRow="0" w:noHBand="0" w:noVBand="1" w:val="04A0"/>
+        <w:tblBorders>
+          <w:top w:val="none"/>
+          <w:left w:val="none"/>
+          <w:bottom w:val="none"/>
+          <w:right w:val="none"/>
+          <w:insideH w:val="none"/>
+          <w:insideV w:val="none"/>
+        </w:tblBorders>
+      </w:tblPr>
+      <w:tblGrid>
+        <w:gridCol w:w="4320"/>
+        <w:gridCol w:w="4320"/>
+      </w:tblGrid>
+      <w:tr>
+        <w:tc>
+          <w:tcPr>
+            <w:tcW w:type="dxa" w:w="4320"/>
+          </w:tcPr>
+          <w:p>
+            <w:r>
+              <w:drawing>
+                <wp:inline xmlns:a="http://schemas.openxmlformats.org/drawingml/2006/main" xmlns:pic="http://schemas.openxmlformats.org/drawingml/2006/picture">
+                  <wp:extent cx="1554480" cy="327019"/>
+                  <wp:docPr id="1" name="Picture 1"/>
+                  <wp:cNvGraphicFramePr>
+                    <a:graphicFrameLocks noChangeAspect="1"/>
+                  </wp:cNvGraphicFramePr>
+                  <a:graphic>
+                    <a:graphicData uri="http://schemas.openxmlformats.org/drawingml/2006/picture">
+                      <pic:pic>
+                        <pic:nvPicPr>
+                          <pic:cNvPr id="0" name="logo_header.png"/>
+                          <pic:cNvPicPr/>
+                        </pic:nvPicPr>
+                        <pic:blipFill>
+                          <a:blip r:embed="rId11"/>
+                          <a:stretch>
+                            <a:fillRect/>
+                          </a:stretch>
+                        </pic:blipFill>
+                        <pic:spPr>
+                          <a:xfrm>
+                            <a:off x="0" y="0"/>
+                            <a:ext cx="1554480" cy="327019"/>
+                          </a:xfrm>
+                          <a:prstGeom prst="rect"/>
+                        </pic:spPr>
+                      </pic:pic>
+                    </a:graphicData>
+                  </a:graphic>
+                </wp:inline>
+              </w:drawing>
+            </w:r>
+          </w:p>
+        </w:tc>
+        <w:tc>
+          <w:tcPr>
+            <w:tcW w:type="dxa" w:w="4320"/>
+          </w:tcPr>
+          <w:p>
+            <w:pPr>
+              <w:jc w:val="right"/>
+            </w:pPr>
+            <w:r>
+              <w:drawing>
+                <wp:inline xmlns:a="http://schemas.openxmlformats.org/drawingml/2006/main" xmlns:pic="http://schemas.openxmlformats.org/drawingml/2006/picture">
+                  <wp:extent cx="914400" cy="416052"/>
+                  <wp:docPr id="2" name="Picture 2"/>
+                  <wp:cNvGraphicFramePr>
+                    <a:graphicFrameLocks noChangeAspect="1"/>
+                  </wp:cNvGraphicFramePr>
+                  <a:graphic>
+                    <a:graphicData uri="http://schemas.openxmlformats.org/drawingml/2006/picture">
+                      <pic:pic>
+                        <pic:nvPicPr>
+                          <pic:cNvPr id="0" name="logo_anima.png"/>
+                          <pic:cNvPicPr/>
+                        </pic:nvPicPr>
+                        <pic:blipFill>
+                          <a:blip r:embed="rId12"/>
+                          <a:stretch>
+                            <a:fillRect/>
+                          </a:stretch>
+                        </pic:blipFill>
+                        <pic:spPr>
+                          <a:xfrm>
+                            <a:off x="0" y="0"/>
+                            <a:ext cx="914400" cy="416052"/>
+                          </a:xfrm>
+                          <a:prstGeom prst="rect"/>
+                        </pic:spPr>
+                      </pic:pic>
+                    </a:graphicData>
+                  </a:graphic>
+                </wp:inline>
+              </w:drawing>
+            </w:r>
+          </w:p>
+        </w:tc>
+      </w:tr>
+    </w:tbl>
+    <w:p/>
     <w:p>
       <w:pPr>
         <w:jc w:val="center"/>
@@ -625,23 +749,49 @@
       <w:r>
         <w:rPr>
           <w:b/>
-          <w:color w:val="16233D"/>
-          <w:sz w:val="26"/>
+          <w:sz w:val="28"/>
         </w:rPr>
         <w:t>CRONOGRAMA DA A3</w:t>
       </w:r>
     </w:p>
-    <w:p>
-      <w:pPr>
-        <w:jc w:val="center"/>
-      </w:pPr>
-      <w:r>
-        <w:rPr>
-          <w:b/>
-        </w:rPr>
-        <w:t>CHECKPOINT 1 – 11/09/2026</w:t>
-      </w:r>
-    </w:p>
+    <w:tbl>
+      <w:tblPr>
+        <w:tblW w:type="auto" w:w="0"/>
+        <w:tblLook w:firstColumn="1" w:firstRow="1" w:lastColumn="0" w:lastRow="0" w:noHBand="0" w:noVBand="1" w:val="04A0"/>
+        <w:tblBorders>
+          <w:top w:val="none"/>
+          <w:left w:val="none"/>
+          <w:bottom w:val="none"/>
+          <w:right w:val="none"/>
+          <w:insideH w:val="none"/>
+          <w:insideV w:val="none"/>
+        </w:tblBorders>
+      </w:tblPr>
+      <w:tblGrid>
+        <w:gridCol w:w="8640"/>
+      </w:tblGrid>
+      <w:tr>
+        <w:tc>
+          <w:tcPr>
+            <w:tcW w:type="dxa" w:w="8640"/>
+            <w:shd w:val="clear" w:color="auto" w:fill="2E5A96"/>
+          </w:tcPr>
+          <w:p>
+            <w:pPr>
+              <w:jc w:val="center"/>
+            </w:pPr>
+            <w:r>
+              <w:rPr>
+                <w:b/>
+                <w:color w:val="FFFFFF"/>
+              </w:rPr>
+              <w:t>CHECKPOINT 1 – 11/09/2026</w:t>
+            </w:r>
+          </w:p>
+        </w:tc>
+      </w:tr>
+    </w:tbl>
+    <w:p/>
     <w:tbl>
       <w:tblPr>
         <w:tblStyle w:val="TableGrid"/>
@@ -660,7 +810,7 @@
         <w:tc>
           <w:tcPr>
             <w:tcW w:type="dxa" w:w="1440"/>
-            <w:shd w:val="clear" w:color="auto" w:fill="1F5FA8"/>
+            <w:shd w:val="clear" w:color="auto" w:fill="4472C4"/>
           </w:tcPr>
           <w:p>
             <w:r/>
@@ -677,7 +827,7 @@
         <w:tc>
           <w:tcPr>
             <w:tcW w:type="dxa" w:w="1440"/>
-            <w:shd w:val="clear" w:color="auto" w:fill="1F5FA8"/>
+            <w:shd w:val="clear" w:color="auto" w:fill="4472C4"/>
           </w:tcPr>
           <w:p>
             <w:r/>
@@ -694,7 +844,7 @@
         <w:tc>
           <w:tcPr>
             <w:tcW w:type="dxa" w:w="1440"/>
-            <w:shd w:val="clear" w:color="auto" w:fill="1F5FA8"/>
+            <w:shd w:val="clear" w:color="auto" w:fill="4472C4"/>
           </w:tcPr>
           <w:p>
             <w:r/>
@@ -711,7 +861,7 @@
         <w:tc>
           <w:tcPr>
             <w:tcW w:type="dxa" w:w="1440"/>
-            <w:shd w:val="clear" w:color="auto" w:fill="1F5FA8"/>
+            <w:shd w:val="clear" w:color="auto" w:fill="4472C4"/>
           </w:tcPr>
           <w:p>
             <w:r/>
@@ -728,7 +878,7 @@
         <w:tc>
           <w:tcPr>
             <w:tcW w:type="dxa" w:w="1440"/>
-            <w:shd w:val="clear" w:color="auto" w:fill="1F5FA8"/>
+            <w:shd w:val="clear" w:color="auto" w:fill="4472C4"/>
           </w:tcPr>
           <w:p>
             <w:r/>
@@ -745,7 +895,7 @@
         <w:tc>
           <w:tcPr>
             <w:tcW w:type="dxa" w:w="1440"/>
-            <w:shd w:val="clear" w:color="auto" w:fill="1F5FA8"/>
+            <w:shd w:val="clear" w:color="auto" w:fill="4472C4"/>
           </w:tcPr>
           <w:p>
             <w:r/>
@@ -772,7 +922,7 @@
                 <w:b w:val="0"/>
                 <w:sz w:val="20"/>
               </w:rPr>
-              <w:t>1. Revisão da Documentação</w:t>
+              <w:t>1.Revisão da Documentação</w:t>
             </w:r>
           </w:p>
         </w:tc>
@@ -863,7 +1013,7 @@
                 <w:b w:val="0"/>
                 <w:sz w:val="20"/>
               </w:rPr>
-              <w:t>2. Redação da Documentação</w:t>
+              <w:t>2.Redação da Documentação</w:t>
             </w:r>
           </w:p>
         </w:tc>
@@ -1045,7 +1195,7 @@
                 <w:b w:val="0"/>
                 <w:sz w:val="20"/>
               </w:rPr>
-              <w:t>4. Configuração e Instalação</w:t>
+              <w:t>4.Configuração e Instalação</w:t>
             </w:r>
           </w:p>
         </w:tc>
@@ -1125,6 +1275,96 @@
         </w:tc>
       </w:tr>
     </w:tbl>
+    <w:p/>
+    <w:p>
+      <w:r>
+        <w:rPr>
+          <w:sz w:val="18"/>
+        </w:rPr>
+        <w:t>Na coluna STATUS inserir a bolinha na cor correspondente a situação da atividade</w:t>
+      </w:r>
+    </w:p>
+    <w:p>
+      <w:r>
+        <w:rPr>
+          <w:b/>
+          <w:sz w:val="18"/>
+        </w:rPr>
+        <w:t xml:space="preserve">Status: </w:t>
+      </w:r>
+      <w:r>
+        <w:rPr>
+          <w:b/>
+          <w:color w:val="008000"/>
+          <w:sz w:val="18"/>
+        </w:rPr>
+        <w:t>Concluído</w:t>
+      </w:r>
+      <w:r>
+        <w:rPr>
+          <w:b/>
+          <w:color w:val="000000"/>
+          <w:sz w:val="18"/>
+        </w:rPr>
+        <w:t xml:space="preserve"> | </w:t>
+      </w:r>
+      <w:r>
+        <w:rPr>
+          <w:b/>
+          <w:color w:val="0070C0"/>
+          <w:sz w:val="18"/>
+        </w:rPr>
+        <w:t>Em desenvolvimento</w:t>
+      </w:r>
+      <w:r>
+        <w:rPr>
+          <w:b/>
+          <w:color w:val="000000"/>
+          <w:sz w:val="18"/>
+        </w:rPr>
+        <w:t xml:space="preserve"> | </w:t>
+      </w:r>
+      <w:r>
+        <w:rPr>
+          <w:b/>
+          <w:color w:val="FF0000"/>
+          <w:sz w:val="18"/>
+        </w:rPr>
+        <w:t>Pendente</w:t>
+      </w:r>
+      <w:r>
+        <w:rPr>
+          <w:b/>
+          <w:color w:val="000000"/>
+          <w:sz w:val="18"/>
+        </w:rPr>
+        <w:t xml:space="preserve"> | </w:t>
+      </w:r>
+      <w:r>
+        <w:rPr>
+          <w:b/>
+          <w:color w:val="7030A0"/>
+          <w:sz w:val="18"/>
+        </w:rPr>
+        <w:t>Cancelado</w:t>
+      </w:r>
+      <w:r>
+        <w:rPr>
+          <w:b/>
+          <w:color w:val="000000"/>
+          <w:sz w:val="18"/>
+        </w:rPr>
+        <w:t xml:space="preserve">| </w:t>
+      </w:r>
+      <w:r>
+        <w:rPr>
+          <w:b/>
+          <w:color w:val="808080"/>
+          <w:sz w:val="18"/>
+        </w:rPr>
+        <w:t>Não iniciado</w:t>
+      </w:r>
+    </w:p>
     <w:sectPr>
       <w:headerReference w:type="default" r:id="rId9"/>
       <w:footerReference w:type="default" r:id="rId10"/>
@@ -1176,7 +1416,7 @@
         <w:i/>
         <w:sz w:val="18"/>
       </w:rPr>
-      <w:t>Profa. Cássia Assis</w:t>
+      <w:t>Profa. Cássia Assia</w:t>
     </w:r>
   </w:p>
 </w:ftr>
@@ -1191,7 +1431,7 @@
     <w:r>
       <w:drawing>
         <wp:inline xmlns:a="http://schemas.openxmlformats.org/drawingml/2006/main" xmlns:pic="http://schemas.openxmlformats.org/drawingml/2006/picture">
-          <wp:extent cx="2377440" cy="500146"/>
+          <wp:extent cx="1554480" cy="327019"/>
           <wp:docPr id="1" name="Picture 1"/>
           <wp:cNvGraphicFramePr>
             <a:graphicFrameLocks noChangeAspect="1"/>
@@ -1212,7 +1452,7 @@
                 <pic:spPr>
                   <a:xfrm>
                     <a:off x="0" y="0"/>
-                    <a:ext cx="2377440" cy="500146"/>
+                    <a:ext cx="1554480" cy="327019"/>
                   </a:xfrm>
                   <a:prstGeom prst="rect"/>
                 </pic:spPr>

</xml_diff>